<commit_message>
Replace every copyrighted or unsourced figure in Chapters 1 to 3
Chapter 1: Figure 1.2 is now a Wikimedia Commons midsagittal MRI (Oliver
Stollmann, attribution licence) in place of the untraceable image.
Chapter 2: Figures 2.1, 2.2, 2.4 to 2.10 redrawn with matplotlib in the
house palette (new make_figures.py); Figure 2.2 had a Healthline
watermark, the others had no recorded source, and 2.7 duplicated 2.3.
Captions rewritten to describe each figure. Figure 2.3 (OpenStax, CC BY
4.0) kept.
Chapter 3: all ten figures redrawn (new make_figures.py): transmission
modes, chemical context, neuromodulatory systems, cholinergic
projections, dopamine prediction error rasters, TD learning shift,
eligibility traces, three-factor rule, DBS placement, stimulator
schematic. Captions rewritten.
Figure Attribution sections, README and memory-bank updated; Word and
PDF outputs rebuilt.

Co-Authored-By: Claude Fable 5.1 <noreply@anthropic.com>
</commit_message>
<xml_diff>
--- a/docs/book/Word/Chapter1/How_the_Brain_Learns_Chapter_1_What_the_Brain_Is.docx
+++ b/docs/book/Word/Chapter1/How_the_Brain_Learns_Chapter_1_What_the_Brain_Is.docx
@@ -469,14 +469,14 @@
       <w:r>
         <w:drawing>
           <wp:inline>
-            <wp:extent cx="5943600" cy="5943600"/>
+            <wp:extent cx="5486400" cy="5486400"/>
             <wp:effectExtent b="0" l="0" r="0" t="0"/>
             <wp:docPr descr="Figure 1.2. Sagittal MRI of the human brain, illustrating large-scale anatomical organization shaped by biological development rather than explicit design." title="" id="35" name="Picture"/>
             <a:graphic>
               <a:graphicData uri="http://schemas.openxmlformats.org/drawingml/2006/picture">
                 <pic:pic>
                   <pic:nvPicPr>
-                    <pic:cNvPr descr="images/figure_1_2.png" id="36" name="Picture"/>
+                    <pic:cNvPr descr="images/mri_midsagittal.jpg" id="36" name="Picture"/>
                     <pic:cNvPicPr>
                       <a:picLocks noChangeArrowheads="1" noChangeAspect="1"/>
                     </pic:cNvPicPr>
@@ -490,7 +490,7 @@
                   <pic:spPr bwMode="auto">
                     <a:xfrm>
                       <a:off x="0" y="0"/>
-                      <a:ext cx="5943600" cy="5943600"/>
+                      <a:ext cx="5486400" cy="5486400"/>
                     </a:xfrm>
                     <a:prstGeom prst="rect">
                       <a:avLst/>
@@ -902,7 +902,25 @@
         <w:pStyle w:val="BodyText"/>
       </w:pPr>
       <w:r>
-        <w:t xml:space="preserve">Figure 1.2: T1-weighted midsagittal magnetic resonance image of a human head; believed to be a public-domain or Creative Commons image from Wikimedia Commons (source file to be confirmed).</w:t>
+        <w:t xml:space="preserve">Figure 1.2:</w:t>
+      </w:r>
+      <w:r>
+        <w:t xml:space="preserve"> </w:t>
+      </w:r>
+      <w:r>
+        <w:t xml:space="preserve">“</w:t>
+      </w:r>
+      <w:r>
+        <w:t xml:space="preserve">Mri brain side view</w:t>
+      </w:r>
+      <w:r>
+        <w:t xml:space="preserve">”</w:t>
+      </w:r>
+      <w:r>
+        <w:t xml:space="preserve"> </w:t>
+      </w:r>
+      <w:r>
+        <w:t xml:space="preserve">(midsagittal magnetic resonance image of a human head) by Oliver Stollmann, free-use attribution license, via Wikimedia Commons.</w:t>
       </w:r>
     </w:p>
     <w:p>

</xml_diff>